<commit_message>
feat(docs): convert PRD documents to .docx format and update README references
</commit_message>
<xml_diff>
--- a/docs/prd/CuocPhiPhuPhiDau.docx
+++ b/docs/prd/CuocPhiPhuPhiDau.docx
@@ -2,7 +2,7 @@
 <file path=word/document.xml><?xml version="1.0" encoding="utf-8"?>
 <w:document xmlns:w="http://schemas.openxmlformats.org/wordprocessingml/2006/main" xmlns:m="http://schemas.openxmlformats.org/officeDocument/2006/math" xmlns:r="http://schemas.openxmlformats.org/officeDocument/2006/relationships" xmlns:o="urn:schemas-microsoft-com:office:office" xmlns:v="urn:schemas-microsoft-com:vml" xmlns:w10="urn:schemas-microsoft-com:office:word" xmlns:a="http://schemas.openxmlformats.org/drawingml/2006/main" xmlns:pic="http://schemas.openxmlformats.org/drawingml/2006/picture" xmlns:wp="http://schemas.openxmlformats.org/drawingml/2006/wordprocessingDrawing">
   <w:body>
-    <w:bookmarkStart w:id="38" w:name="X64883d64f534bfb0e54d638a339dae4e2b446cf"/>
+    <w:bookmarkStart w:id="33" w:name="X64883d64f534bfb0e54d638a339dae4e2b446cf"/>
     <w:p>
       <w:pPr>
         <w:pStyle w:val="Heading1"/>
@@ -36,72 +36,7 @@
         <w:pStyle w:val="BodyText"/>
       </w:pPr>
       <w:r>
-        <w:t xml:space="preserve">Xem thêm:</w:t>
-      </w:r>
-      <w:r>
-        <w:t xml:space="preserve"> </w:t>
-      </w:r>
-      <w:hyperlink r:id="rId9">
-        <w:r>
-          <w:rPr>
-            <w:rStyle w:val="Hyperlink"/>
-          </w:rPr>
-          <w:t xml:space="preserve">lịch sử thay đổi</w:t>
-        </w:r>
-      </w:hyperlink>
-      <w:r>
-        <w:t xml:space="preserve"> </w:t>
-      </w:r>
-      <w:r>
-        <w:t xml:space="preserve">·</w:t>
-      </w:r>
-      <w:r>
-        <w:t xml:space="preserve"> </w:t>
-      </w:r>
-      <w:hyperlink r:id="rId10">
-        <w:r>
-          <w:rPr>
-            <w:rStyle w:val="Hyperlink"/>
-          </w:rPr>
-          <w:t xml:space="preserve">mục lục PRD</w:t>
-        </w:r>
-      </w:hyperlink>
-      <w:r>
-        <w:t xml:space="preserve"> </w:t>
-      </w:r>
-      <w:r>
-        <w:t xml:space="preserve">·</w:t>
-      </w:r>
-      <w:r>
-        <w:t xml:space="preserve"> </w:t>
-      </w:r>
-      <w:hyperlink r:id="rId11">
-        <w:r>
-          <w:rPr>
-            <w:rStyle w:val="Hyperlink"/>
-          </w:rPr>
-          <w:t xml:space="preserve">dữ liệu và lịch sử cước</w:t>
-        </w:r>
-      </w:hyperlink>
-      <w:r>
-        <w:t xml:space="preserve"> </w:t>
-      </w:r>
-      <w:r>
-        <w:t xml:space="preserve">·</w:t>
-      </w:r>
-      <w:r>
-        <w:t xml:space="preserve"> </w:t>
-      </w:r>
-      <w:hyperlink r:id="rId12">
-        <w:r>
-          <w:rPr>
-            <w:rStyle w:val="Hyperlink"/>
-          </w:rPr>
-          <w:t xml:space="preserve">phương án tính cước tự động</w:t>
-        </w:r>
-      </w:hyperlink>
-      <w:r>
-        <w:t xml:space="preserve">.</w:t>
+        <w:t xml:space="preserve">Xem thêm: lịch sử thay đổi · mục lục PRD · dữ liệu và lịch sử cước · phương án tính cước tự động.</w:t>
       </w:r>
     </w:p>
     <w:p>
@@ -111,7 +46,7 @@
         </w:pict>
       </w:r>
     </w:p>
-    <w:bookmarkStart w:id="14" w:name="mô-hình-tính-cước"/>
+    <w:bookmarkStart w:id="10" w:name="mô-hình-tính-cước"/>
     <w:p>
       <w:pPr>
         <w:pStyle w:val="Heading2"/>
@@ -454,7 +389,7 @@
         <w:t xml:space="preserve">.</w:t>
       </w:r>
     </w:p>
-    <w:bookmarkStart w:id="13" w:name="tách-tham-số-tĩnh-động"/>
+    <w:bookmarkStart w:id="9" w:name="tách-tham-số-tĩnh-động"/>
     <w:p>
       <w:pPr>
         <w:pStyle w:val="Heading3"/>
@@ -954,9 +889,9 @@
         </w:pict>
       </w:r>
     </w:p>
-    <w:bookmarkEnd w:id="13"/>
-    <w:bookmarkEnd w:id="14"/>
-    <w:bookmarkStart w:id="23" w:name="các-công-thức-gốc"/>
+    <w:bookmarkEnd w:id="9"/>
+    <w:bookmarkEnd w:id="10"/>
+    <w:bookmarkStart w:id="19" w:name="các-công-thức-gốc"/>
     <w:p>
       <w:pPr>
         <w:pStyle w:val="Heading2"/>
@@ -1108,7 +1043,7 @@
         <w:t xml:space="preserve">suốt tài liệu và trong các bảng số ở §6.</w:t>
       </w:r>
     </w:p>
-    <w:bookmarkStart w:id="15" w:name="số-km-tính-cước-luôn-tính-2-chiều"/>
+    <w:bookmarkStart w:id="11" w:name="số-km-tính-cước-luôn-tính-2-chiều"/>
     <w:p>
       <w:pPr>
         <w:pStyle w:val="Heading3"/>
@@ -1170,8 +1105,8 @@
         <w:t xml:space="preserve">không liên quan khách).</w:t>
       </w:r>
     </w:p>
-    <w:bookmarkEnd w:id="15"/>
-    <w:bookmarkStart w:id="16" w:name="tổng-lít-dầu-chuyến"/>
+    <w:bookmarkEnd w:id="11"/>
+    <w:bookmarkStart w:id="12" w:name="tổng-lít-dầu-chuyến"/>
     <w:p>
       <w:pPr>
         <w:pStyle w:val="Heading3"/>
@@ -1224,8 +1159,8 @@
         <w:t xml:space="preserve">(lít/km), xem §4.</w:t>
       </w:r>
     </w:p>
-    <w:bookmarkEnd w:id="16"/>
-    <w:bookmarkStart w:id="17" w:name="X241a80f17c6d0c5c460b72521ed38db37a83d0a"/>
+    <w:bookmarkEnd w:id="12"/>
+    <w:bookmarkStart w:id="13" w:name="X241a80f17c6d0c5c460b72521ed38db37a83d0a"/>
     <w:p>
       <w:pPr>
         <w:pStyle w:val="Heading3"/>
@@ -1372,8 +1307,8 @@
         <w:t xml:space="preserve">Chỉ khi ký lại giá gốc mới được đổi mốc này.</w:t>
       </w:r>
     </w:p>
-    <w:bookmarkEnd w:id="17"/>
-    <w:bookmarkStart w:id="18" w:name="giá-dầu-kỳ-hiện-hành"/>
+    <w:bookmarkEnd w:id="13"/>
+    <w:bookmarkStart w:id="14" w:name="giá-dầu-kỳ-hiện-hành"/>
     <w:p>
       <w:pPr>
         <w:pStyle w:val="Heading3"/>
@@ -1596,8 +1531,8 @@
         </w:tc>
       </w:tr>
     </w:tbl>
-    <w:bookmarkEnd w:id="18"/>
-    <w:bookmarkStart w:id="19" w:name="phụ-phí-dầu-chuyến"/>
+    <w:bookmarkEnd w:id="14"/>
+    <w:bookmarkStart w:id="15" w:name="phụ-phí-dầu-chuyến"/>
     <w:p>
       <w:pPr>
         <w:pStyle w:val="Heading3"/>
@@ -1779,8 +1714,8 @@
         <w:t xml:space="preserve">chia sẻ.</w:t>
       </w:r>
     </w:p>
-    <w:bookmarkEnd w:id="19"/>
-    <w:bookmarkStart w:id="20" w:name="giá-cước-đã-chia-sẻ"/>
+    <w:bookmarkEnd w:id="15"/>
+    <w:bookmarkStart w:id="16" w:name="giá-cước-đã-chia-sẻ"/>
     <w:p>
       <w:pPr>
         <w:pStyle w:val="Heading3"/>
@@ -1833,8 +1768,8 @@
         <w:t xml:space="preserve">(xem §3).</w:t>
       </w:r>
     </w:p>
-    <w:bookmarkEnd w:id="20"/>
-    <w:bookmarkStart w:id="21" w:name="cước-cuối-cùng"/>
+    <w:bookmarkEnd w:id="16"/>
+    <w:bookmarkStart w:id="17" w:name="cước-cuối-cùng"/>
     <w:p>
       <w:pPr>
         <w:pStyle w:val="Heading3"/>
@@ -1975,8 +1910,8 @@
         <w:t xml:space="preserve">đúng số tiền đã chốt.</w:t>
       </w:r>
     </w:p>
-    <w:bookmarkEnd w:id="21"/>
-    <w:bookmarkStart w:id="22" w:name="công-thức-tổng-hợp"/>
+    <w:bookmarkEnd w:id="17"/>
+    <w:bookmarkStart w:id="18" w:name="công-thức-tổng-hợp"/>
     <w:p>
       <w:pPr>
         <w:pStyle w:val="Heading3"/>
@@ -2119,9 +2054,9 @@
         </w:pict>
       </w:r>
     </w:p>
-    <w:bookmarkEnd w:id="22"/>
-    <w:bookmarkEnd w:id="23"/>
-    <w:bookmarkStart w:id="26" w:name="Xaeb7f7405b929d2b22e5cb6204ab4f59ae00304"/>
+    <w:bookmarkEnd w:id="18"/>
+    <w:bookmarkEnd w:id="19"/>
+    <w:bookmarkStart w:id="22" w:name="Xaeb7f7405b929d2b22e5cb6204ab4f59ae00304"/>
     <w:p>
       <w:pPr>
         <w:pStyle w:val="Heading2"/>
@@ -2501,7 +2436,7 @@
         </w:tc>
       </w:tr>
     </w:tbl>
-    <w:bookmarkStart w:id="24" w:name="nhà-máy-và-bên-nhận-hàng"/>
+    <w:bookmarkStart w:id="20" w:name="nhà-máy-và-bên-nhận-hàng"/>
     <w:p>
       <w:pPr>
         <w:pStyle w:val="Heading3"/>
@@ -2851,8 +2786,8 @@
         <w:t xml:space="preserve">Tên nhà máy hoặc bên nhận hàng không thay thế tuyến được thỏa thuận trong hợp đồng.</w:t>
       </w:r>
     </w:p>
-    <w:bookmarkEnd w:id="24"/>
-    <w:bookmarkStart w:id="25" w:name="quan-sát-về-cấu-trúc-giá"/>
+    <w:bookmarkEnd w:id="20"/>
+    <w:bookmarkStart w:id="21" w:name="quan-sát-về-cấu-trúc-giá"/>
     <w:p>
       <w:pPr>
         <w:pStyle w:val="Heading3"/>
@@ -3065,9 +3000,9 @@
         </w:pict>
       </w:r>
     </w:p>
-    <w:bookmarkEnd w:id="25"/>
-    <w:bookmarkEnd w:id="26"/>
-    <w:bookmarkStart w:id="27" w:name="định-mức-dầu-theo-loại-xe"/>
+    <w:bookmarkEnd w:id="21"/>
+    <w:bookmarkEnd w:id="22"/>
+    <w:bookmarkStart w:id="23" w:name="định-mức-dầu-theo-loại-xe"/>
     <w:p>
       <w:pPr>
         <w:pStyle w:val="Heading2"/>
@@ -3446,8 +3381,8 @@
         </w:pict>
       </w:r>
     </w:p>
-    <w:bookmarkEnd w:id="27"/>
-    <w:bookmarkStart w:id="28" w:name="bảng-giá-gốc-i-theo-tuyến"/>
+    <w:bookmarkEnd w:id="23"/>
+    <w:bookmarkStart w:id="24" w:name="bảng-giá-gốc-i-theo-tuyến"/>
     <w:p>
       <w:pPr>
         <w:pStyle w:val="Heading2"/>
@@ -4117,8 +4052,8 @@
         </w:pict>
       </w:r>
     </w:p>
-    <w:bookmarkEnd w:id="28"/>
-    <w:bookmarkStart w:id="31" w:name="bảng-cước-thành-phẩm"/>
+    <w:bookmarkEnd w:id="24"/>
+    <w:bookmarkStart w:id="27" w:name="bảng-cước-thành-phẩm"/>
     <w:p>
       <w:pPr>
         <w:pStyle w:val="Heading2"/>
@@ -4127,7 +4062,7 @@
         <w:t xml:space="preserve">6. Bảng cước thành phẩm</w:t>
       </w:r>
     </w:p>
-    <w:bookmarkStart w:id="29" w:name="X5e76369bc6693da2def278bdc39dfe966c9fc8e"/>
+    <w:bookmarkStart w:id="25" w:name="X5e76369bc6693da2def278bdc39dfe966c9fc8e"/>
     <w:p>
       <w:pPr>
         <w:pStyle w:val="Heading3"/>
@@ -6712,8 +6647,8 @@
         </w:tc>
       </w:tr>
     </w:tbl>
-    <w:bookmarkEnd w:id="29"/>
-    <w:bookmarkStart w:id="30" w:name="X0eb38b508715c8718bf0b681c67a335ffcebffe"/>
+    <w:bookmarkEnd w:id="25"/>
+    <w:bookmarkStart w:id="26" w:name="X0eb38b508715c8718bf0b681c67a335ffcebffe"/>
     <w:p>
       <w:pPr>
         <w:pStyle w:val="Heading3"/>
@@ -7721,9 +7656,9 @@
         </w:pict>
       </w:r>
     </w:p>
-    <w:bookmarkEnd w:id="30"/>
-    <w:bookmarkEnd w:id="31"/>
-    <w:bookmarkStart w:id="32" w:name="cách-vận-hành-khi-giá-dầu-đổi"/>
+    <w:bookmarkEnd w:id="26"/>
+    <w:bookmarkEnd w:id="27"/>
+    <w:bookmarkStart w:id="28" w:name="cách-vận-hành-khi-giá-dầu-đổi"/>
     <w:p>
       <w:pPr>
         <w:pStyle w:val="Heading2"/>
@@ -7894,20 +7829,12 @@
       <w:r>
         <w:t xml:space="preserve"> </w:t>
       </w:r>
-      <w:hyperlink r:id="rId12">
-        <w:r>
-          <w:rPr>
-            <w:rStyle w:val="Hyperlink"/>
-          </w:rPr>
-          <w:t xml:space="preserve">phương án tính cước</w:t>
-        </w:r>
-      </w:hyperlink>
-      <w:r>
-        <w:t xml:space="preserve">.</w:t>
-      </w:r>
-    </w:p>
-    <w:bookmarkEnd w:id="32"/>
-    <w:bookmarkStart w:id="33" w:name="thông-tin-người-dùng-cần-xem-và-sửa"/>
+      <w:r>
+        <w:t xml:space="preserve">phương án tính cước.</w:t>
+      </w:r>
+    </w:p>
+    <w:bookmarkEnd w:id="28"/>
+    <w:bookmarkStart w:id="29" w:name="thông-tin-người-dùng-cần-xem-và-sửa"/>
     <w:p>
       <w:pPr>
         <w:pStyle w:val="Heading2"/>
@@ -8047,25 +7974,11 @@
         <w:pStyle w:val="FirstParagraph"/>
       </w:pPr>
       <w:r>
-        <w:t xml:space="preserve">Chi tiết tại</w:t>
-      </w:r>
-      <w:r>
-        <w:t xml:space="preserve"> </w:t>
-      </w:r>
-      <w:hyperlink r:id="rId11">
-        <w:r>
-          <w:rPr>
-            <w:rStyle w:val="Hyperlink"/>
-          </w:rPr>
-          <w:t xml:space="preserve">yêu cầu dữ liệu và lịch sử cước</w:t>
-        </w:r>
-      </w:hyperlink>
-      <w:r>
-        <w:t xml:space="preserve">.</w:t>
-      </w:r>
-    </w:p>
-    <w:bookmarkEnd w:id="33"/>
-    <w:bookmarkStart w:id="34" w:name="phân-biệt-thiếu-dữ-liệu-và-giá-hợp-lệ"/>
+        <w:t xml:space="preserve">Chi tiết tại yêu cầu dữ liệu và lịch sử cước.</w:t>
+      </w:r>
+    </w:p>
+    <w:bookmarkEnd w:id="29"/>
+    <w:bookmarkStart w:id="30" w:name="phân-biệt-thiếu-dữ-liệu-và-giá-hợp-lệ"/>
     <w:p>
       <w:pPr>
         <w:pStyle w:val="Heading2"/>
@@ -8277,8 +8190,8 @@
         </w:tc>
       </w:tr>
     </w:tbl>
-    <w:bookmarkEnd w:id="34"/>
-    <w:bookmarkStart w:id="36" w:name="điểm-còn-cần-khách-hàng-làm-rõ"/>
+    <w:bookmarkEnd w:id="30"/>
+    <w:bookmarkStart w:id="31" w:name="điểm-còn-cần-khách-hàng-làm-rõ"/>
     <w:p>
       <w:pPr>
         <w:pStyle w:val="Heading2"/>
@@ -8372,42 +8285,17 @@
         <w:t xml:space="preserve"> </w:t>
       </w:r>
       <w:r>
-        <w:t xml:space="preserve">nhận. Xem</w:t>
-      </w:r>
-      <w:r>
-        <w:t xml:space="preserve"> </w:t>
-      </w:r>
-      <w:hyperlink r:id="rId35">
-        <w:r>
-          <w:rPr>
-            <w:rStyle w:val="Hyperlink"/>
-          </w:rPr>
-          <w:t xml:space="preserve">đầu vào nghiệp vụ còn mở</w:t>
-        </w:r>
-      </w:hyperlink>
-      <w:r>
-        <w:t xml:space="preserve"> </w:t>
-      </w:r>
-      <w:r>
-        <w:t xml:space="preserve">và</w:t>
-      </w:r>
-      <w:r>
-        <w:t xml:space="preserve"> </w:t>
-      </w:r>
-      <w:hyperlink r:id="rId12">
-        <w:r>
-          <w:rPr>
-            <w:rStyle w:val="Hyperlink"/>
-          </w:rPr>
-          <w:t xml:space="preserve">quy trình tính cước</w:t>
-        </w:r>
-      </w:hyperlink>
-      <w:r>
-        <w:t xml:space="preserve">.</w:t>
-      </w:r>
-    </w:p>
-    <w:bookmarkEnd w:id="36"/>
-    <w:bookmarkStart w:id="37" w:name="tiêu-chí-chấp-nhận"/>
+        <w:t xml:space="preserve">nhận. Xem đầu vào nghiệp vụ còn mở và</w:t>
+      </w:r>
+      <w:r>
+        <w:t xml:space="preserve"> </w:t>
+      </w:r>
+      <w:r>
+        <w:t xml:space="preserve">quy trình tính cước.</w:t>
+      </w:r>
+    </w:p>
+    <w:bookmarkEnd w:id="31"/>
+    <w:bookmarkStart w:id="32" w:name="tiêu-chí-chấp-nhận"/>
     <w:p>
       <w:pPr>
         <w:pStyle w:val="Heading2"/>
@@ -8506,8 +8394,8 @@
         <w:t xml:space="preserve">không bị cắt. Bấm lại hoặc mất kết nối không tạo tiền trùng hay tự gửi lại.</w:t>
       </w:r>
     </w:p>
-    <w:bookmarkEnd w:id="37"/>
-    <w:bookmarkEnd w:id="38"/>
+    <w:bookmarkEnd w:id="32"/>
+    <w:bookmarkEnd w:id="33"/>
     <w:sectPr>
       <w:footnotePr>
         <w:numRestart w:val="eachSect"/>

</xml_diff>